<commit_message>
On Tap GK' !
!
</commit_message>
<xml_diff>
--- a/Lab_6_16_3/22669281_NguyenHuuSang_Lab6_16_03.docx
+++ b/Lab_6_16_3/22669281_NguyenHuuSang_Lab6_16_03.docx
@@ -1574,7 +1574,6 @@
                 <w:kern w:val="0"/>
                 <w:sz w:val="28"/>
                 <w:szCs w:val="28"/>
-                <w:lang/>
                 <w14:ligatures w14:val="none"/>
               </w:rPr>
             </w:pPr>
@@ -1586,7 +1585,6 @@
                 <w:kern w:val="0"/>
                 <w:sz w:val="28"/>
                 <w:szCs w:val="28"/>
-                <w:lang/>
                 <w14:ligatures w14:val="none"/>
               </w:rPr>
               <w:t>Tiêu chí</w:t>
@@ -1608,7 +1606,6 @@
                 <w:kern w:val="0"/>
                 <w:sz w:val="28"/>
                 <w:szCs w:val="28"/>
-                <w:lang/>
                 <w14:ligatures w14:val="none"/>
               </w:rPr>
             </w:pPr>
@@ -1620,7 +1617,6 @@
                 <w:kern w:val="0"/>
                 <w:sz w:val="28"/>
                 <w:szCs w:val="28"/>
-                <w:lang/>
                 <w14:ligatures w14:val="none"/>
               </w:rPr>
               <w:t>Nội dung đánh giá</w:t>
@@ -1642,7 +1638,6 @@
                 <w:kern w:val="0"/>
                 <w:sz w:val="28"/>
                 <w:szCs w:val="28"/>
-                <w:lang/>
                 <w14:ligatures w14:val="none"/>
               </w:rPr>
             </w:pPr>
@@ -1654,7 +1649,6 @@
                 <w:kern w:val="0"/>
                 <w:sz w:val="28"/>
                 <w:szCs w:val="28"/>
-                <w:lang/>
                 <w14:ligatures w14:val="none"/>
               </w:rPr>
               <w:t>Điểm</w:t>
@@ -1676,7 +1670,6 @@
                 <w:kern w:val="0"/>
                 <w:sz w:val="28"/>
                 <w:szCs w:val="28"/>
-                <w:lang/>
                 <w14:ligatures w14:val="none"/>
               </w:rPr>
             </w:pPr>
@@ -1686,7 +1679,6 @@
                 <w:kern w:val="0"/>
                 <w:sz w:val="28"/>
                 <w:szCs w:val="28"/>
-                <w:lang/>
                 <w14:ligatures w14:val="none"/>
               </w:rPr>
               <w:t>1</w:t>
@@ -1706,7 +1698,6 @@
                 <w:kern w:val="0"/>
                 <w:sz w:val="28"/>
                 <w:szCs w:val="28"/>
-                <w:lang/>
                 <w14:ligatures w14:val="none"/>
               </w:rPr>
             </w:pPr>
@@ -1716,7 +1707,6 @@
                 <w:kern w:val="0"/>
                 <w:sz w:val="28"/>
                 <w:szCs w:val="28"/>
-                <w:lang/>
                 <w14:ligatures w14:val="none"/>
               </w:rPr>
               <w:t>Cấu hình DynamoDB Local trên Docker và kết nối Node.js thành công</w:t>
@@ -1736,7 +1726,6 @@
                 <w:kern w:val="0"/>
                 <w:sz w:val="28"/>
                 <w:szCs w:val="28"/>
-                <w:lang/>
                 <w14:ligatures w14:val="none"/>
               </w:rPr>
             </w:pPr>
@@ -1746,7 +1735,6 @@
                 <w:kern w:val="0"/>
                 <w:sz w:val="28"/>
                 <w:szCs w:val="28"/>
-                <w:lang/>
                 <w14:ligatures w14:val="none"/>
               </w:rPr>
               <w:t>1.0</w:t>
@@ -1768,7 +1756,6 @@
                 <w:kern w:val="0"/>
                 <w:sz w:val="28"/>
                 <w:szCs w:val="28"/>
-                <w:lang/>
                 <w14:ligatures w14:val="none"/>
               </w:rPr>
             </w:pPr>
@@ -1778,7 +1765,6 @@
                 <w:kern w:val="0"/>
                 <w:sz w:val="28"/>
                 <w:szCs w:val="28"/>
-                <w:lang/>
                 <w14:ligatures w14:val="none"/>
               </w:rPr>
               <w:t>2</w:t>
@@ -1798,7 +1784,6 @@
                 <w:kern w:val="0"/>
                 <w:sz w:val="28"/>
                 <w:szCs w:val="28"/>
-                <w:lang/>
                 <w14:ligatures w14:val="none"/>
               </w:rPr>
             </w:pPr>
@@ -1808,7 +1793,6 @@
                 <w:kern w:val="0"/>
                 <w:sz w:val="28"/>
                 <w:szCs w:val="28"/>
-                <w:lang/>
                 <w14:ligatures w14:val="none"/>
               </w:rPr>
               <w:t>Tổ chức dự án đúng mô hình MVC</w:t>
@@ -1828,7 +1812,6 @@
                 <w:kern w:val="0"/>
                 <w:sz w:val="28"/>
                 <w:szCs w:val="28"/>
-                <w:lang/>
                 <w14:ligatures w14:val="none"/>
               </w:rPr>
             </w:pPr>
@@ -1838,7 +1821,6 @@
                 <w:kern w:val="0"/>
                 <w:sz w:val="28"/>
                 <w:szCs w:val="28"/>
-                <w:lang/>
                 <w14:ligatures w14:val="none"/>
               </w:rPr>
               <w:t>1.0</w:t>
@@ -1860,7 +1842,6 @@
                 <w:kern w:val="0"/>
                 <w:sz w:val="28"/>
                 <w:szCs w:val="28"/>
-                <w:lang/>
                 <w14:ligatures w14:val="none"/>
               </w:rPr>
             </w:pPr>
@@ -1870,7 +1851,6 @@
                 <w:kern w:val="0"/>
                 <w:sz w:val="28"/>
                 <w:szCs w:val="28"/>
-                <w:lang/>
                 <w14:ligatures w14:val="none"/>
               </w:rPr>
               <w:t>3</w:t>
@@ -1890,7 +1870,6 @@
                 <w:kern w:val="0"/>
                 <w:sz w:val="28"/>
                 <w:szCs w:val="28"/>
-                <w:lang/>
                 <w14:ligatures w14:val="none"/>
               </w:rPr>
             </w:pPr>
@@ -1900,7 +1879,6 @@
                 <w:kern w:val="0"/>
                 <w:sz w:val="28"/>
                 <w:szCs w:val="28"/>
-                <w:lang/>
                 <w14:ligatures w14:val="none"/>
               </w:rPr>
               <w:t>Trang đầu hiển thị danh sách sản phẩm bằng EJS dạng table, có hình ảnh</w:t>
@@ -1941,7 +1919,6 @@
                 <w:kern w:val="0"/>
                 <w:sz w:val="28"/>
                 <w:szCs w:val="28"/>
-                <w:lang/>
                 <w14:ligatures w14:val="none"/>
               </w:rPr>
               <w:t>.</w:t>
@@ -1974,7 +1951,6 @@
                 <w:kern w:val="0"/>
                 <w:sz w:val="28"/>
                 <w:szCs w:val="28"/>
-                <w:lang/>
                 <w14:ligatures w14:val="none"/>
               </w:rPr>
             </w:pPr>
@@ -1984,7 +1960,6 @@
                 <w:kern w:val="0"/>
                 <w:sz w:val="28"/>
                 <w:szCs w:val="28"/>
-                <w:lang/>
                 <w14:ligatures w14:val="none"/>
               </w:rPr>
               <w:t>4</w:t>
@@ -2004,7 +1979,6 @@
                 <w:kern w:val="0"/>
                 <w:sz w:val="28"/>
                 <w:szCs w:val="28"/>
-                <w:lang/>
                 <w14:ligatures w14:val="none"/>
               </w:rPr>
             </w:pPr>
@@ -2014,7 +1988,6 @@
                 <w:kern w:val="0"/>
                 <w:sz w:val="28"/>
                 <w:szCs w:val="28"/>
-                <w:lang/>
                 <w14:ligatures w14:val="none"/>
               </w:rPr>
               <w:t>Chức năng thêm sản phẩm, upload ảnh, lưu đường dẫn ảnh vào DynamoDB</w:t>
@@ -2055,7 +2028,6 @@
                 <w:kern w:val="0"/>
                 <w:sz w:val="28"/>
                 <w:szCs w:val="28"/>
-                <w:lang/>
                 <w14:ligatures w14:val="none"/>
               </w:rPr>
               <w:t>.</w:t>
@@ -2088,7 +2060,6 @@
                 <w:kern w:val="0"/>
                 <w:sz w:val="28"/>
                 <w:szCs w:val="28"/>
-                <w:lang/>
                 <w14:ligatures w14:val="none"/>
               </w:rPr>
             </w:pPr>
@@ -2098,7 +2069,6 @@
                 <w:kern w:val="0"/>
                 <w:sz w:val="28"/>
                 <w:szCs w:val="28"/>
-                <w:lang/>
                 <w14:ligatures w14:val="none"/>
               </w:rPr>
               <w:t>5</w:t>
@@ -2118,7 +2088,6 @@
                 <w:kern w:val="0"/>
                 <w:sz w:val="28"/>
                 <w:szCs w:val="28"/>
-                <w:lang/>
                 <w14:ligatures w14:val="none"/>
               </w:rPr>
             </w:pPr>
@@ -2128,7 +2097,6 @@
                 <w:kern w:val="0"/>
                 <w:sz w:val="28"/>
                 <w:szCs w:val="28"/>
-                <w:lang/>
                 <w14:ligatures w14:val="none"/>
               </w:rPr>
               <w:t>Chức năng sửa sản phẩm, cập nhật thông tin và ảnh</w:t>
@@ -2148,7 +2116,6 @@
                 <w:kern w:val="0"/>
                 <w:sz w:val="28"/>
                 <w:szCs w:val="28"/>
-                <w:lang/>
                 <w14:ligatures w14:val="none"/>
               </w:rPr>
             </w:pPr>
@@ -2158,7 +2125,6 @@
                 <w:kern w:val="0"/>
                 <w:sz w:val="28"/>
                 <w:szCs w:val="28"/>
-                <w:lang/>
                 <w14:ligatures w14:val="none"/>
               </w:rPr>
               <w:t>1.5</w:t>
@@ -2180,7 +2146,6 @@
                 <w:kern w:val="0"/>
                 <w:sz w:val="28"/>
                 <w:szCs w:val="28"/>
-                <w:lang/>
                 <w14:ligatures w14:val="none"/>
               </w:rPr>
             </w:pPr>
@@ -2190,7 +2155,6 @@
                 <w:kern w:val="0"/>
                 <w:sz w:val="28"/>
                 <w:szCs w:val="28"/>
-                <w:lang/>
                 <w14:ligatures w14:val="none"/>
               </w:rPr>
               <w:t>6</w:t>
@@ -2210,7 +2174,6 @@
                 <w:kern w:val="0"/>
                 <w:sz w:val="28"/>
                 <w:szCs w:val="28"/>
-                <w:lang/>
                 <w14:ligatures w14:val="none"/>
               </w:rPr>
             </w:pPr>
@@ -2220,7 +2183,6 @@
                 <w:kern w:val="0"/>
                 <w:sz w:val="28"/>
                 <w:szCs w:val="28"/>
-                <w:lang/>
                 <w14:ligatures w14:val="none"/>
               </w:rPr>
               <w:t>Chức năng xóa sản phẩm</w:t>
@@ -2240,7 +2202,6 @@
                 <w:kern w:val="0"/>
                 <w:sz w:val="28"/>
                 <w:szCs w:val="28"/>
-                <w:lang/>
                 <w14:ligatures w14:val="none"/>
               </w:rPr>
             </w:pPr>
@@ -2250,7 +2211,6 @@
                 <w:kern w:val="0"/>
                 <w:sz w:val="28"/>
                 <w:szCs w:val="28"/>
-                <w:lang/>
                 <w14:ligatures w14:val="none"/>
               </w:rPr>
               <w:t>1.0</w:t>
@@ -2272,7 +2232,6 @@
                 <w:kern w:val="0"/>
                 <w:sz w:val="28"/>
                 <w:szCs w:val="28"/>
-                <w:lang/>
                 <w14:ligatures w14:val="none"/>
               </w:rPr>
             </w:pPr>
@@ -2282,7 +2241,6 @@
                 <w:kern w:val="0"/>
                 <w:sz w:val="28"/>
                 <w:szCs w:val="28"/>
-                <w:lang/>
                 <w14:ligatures w14:val="none"/>
               </w:rPr>
               <w:t>7</w:t>
@@ -2302,7 +2260,6 @@
                 <w:kern w:val="0"/>
                 <w:sz w:val="28"/>
                 <w:szCs w:val="28"/>
-                <w:lang/>
                 <w14:ligatures w14:val="none"/>
               </w:rPr>
             </w:pPr>
@@ -2312,7 +2269,6 @@
                 <w:kern w:val="0"/>
                 <w:sz w:val="28"/>
                 <w:szCs w:val="28"/>
-                <w:lang/>
                 <w14:ligatures w14:val="none"/>
               </w:rPr>
               <w:t>Chức năng xem chi tiết sản phẩm</w:t>
@@ -2332,7 +2288,6 @@
                 <w:kern w:val="0"/>
                 <w:sz w:val="28"/>
                 <w:szCs w:val="28"/>
-                <w:lang/>
                 <w14:ligatures w14:val="none"/>
               </w:rPr>
             </w:pPr>
@@ -2342,7 +2297,6 @@
                 <w:kern w:val="0"/>
                 <w:sz w:val="28"/>
                 <w:szCs w:val="28"/>
-                <w:lang/>
                 <w14:ligatures w14:val="none"/>
               </w:rPr>
               <w:t>0.5</w:t>
@@ -2364,7 +2318,6 @@
                 <w:kern w:val="0"/>
                 <w:sz w:val="28"/>
                 <w:szCs w:val="28"/>
-                <w:lang/>
                 <w14:ligatures w14:val="none"/>
               </w:rPr>
             </w:pPr>
@@ -2374,7 +2327,6 @@
                 <w:kern w:val="0"/>
                 <w:sz w:val="28"/>
                 <w:szCs w:val="28"/>
-                <w:lang/>
                 <w14:ligatures w14:val="none"/>
               </w:rPr>
               <w:t>8</w:t>
@@ -2394,7 +2346,6 @@
                 <w:kern w:val="0"/>
                 <w:sz w:val="28"/>
                 <w:szCs w:val="28"/>
-                <w:lang/>
                 <w14:ligatures w14:val="none"/>
               </w:rPr>
             </w:pPr>
@@ -2404,7 +2355,6 @@
                 <w:kern w:val="0"/>
                 <w:sz w:val="28"/>
                 <w:szCs w:val="28"/>
-                <w:lang/>
                 <w14:ligatures w14:val="none"/>
               </w:rPr>
               <w:t>Giao diện rõ ràng, chương trình chạy ổn định</w:t>
@@ -2424,7 +2374,6 @@
                 <w:kern w:val="0"/>
                 <w:sz w:val="28"/>
                 <w:szCs w:val="28"/>
-                <w:lang/>
                 <w14:ligatures w14:val="none"/>
               </w:rPr>
             </w:pPr>
@@ -2434,7 +2383,6 @@
                 <w:kern w:val="0"/>
                 <w:sz w:val="28"/>
                 <w:szCs w:val="28"/>
-                <w:lang/>
                 <w14:ligatures w14:val="none"/>
               </w:rPr>
               <w:t>1.0</w:t>
@@ -2456,7 +2404,6 @@
                 <w:kern w:val="0"/>
                 <w:sz w:val="28"/>
                 <w:szCs w:val="28"/>
-                <w:lang/>
                 <w14:ligatures w14:val="none"/>
               </w:rPr>
             </w:pPr>
@@ -2475,7 +2422,6 @@
                 <w:kern w:val="0"/>
                 <w:sz w:val="28"/>
                 <w:szCs w:val="28"/>
-                <w:lang/>
                 <w14:ligatures w14:val="none"/>
               </w:rPr>
             </w:pPr>
@@ -2487,7 +2433,6 @@
                 <w:kern w:val="0"/>
                 <w:sz w:val="28"/>
                 <w:szCs w:val="28"/>
-                <w:lang/>
                 <w14:ligatures w14:val="none"/>
               </w:rPr>
               <w:t>Tổng cộng</w:t>
@@ -2507,7 +2452,6 @@
                 <w:kern w:val="0"/>
                 <w:sz w:val="28"/>
                 <w:szCs w:val="28"/>
-                <w:lang/>
                 <w14:ligatures w14:val="none"/>
               </w:rPr>
             </w:pPr>
@@ -2532,7 +2476,6 @@
                 <w:kern w:val="0"/>
                 <w:sz w:val="28"/>
                 <w:szCs w:val="28"/>
-                <w:lang/>
                 <w14:ligatures w14:val="none"/>
               </w:rPr>
               <w:t>.0</w:t>
@@ -2550,7 +2493,6 @@
           <w:kern w:val="0"/>
           <w:sz w:val="28"/>
           <w:szCs w:val="28"/>
-          <w:lang/>
           <w14:ligatures w14:val="none"/>
         </w:rPr>
       </w:pPr>
@@ -2562,7 +2504,6 @@
           <w:kern w:val="0"/>
           <w:sz w:val="28"/>
           <w:szCs w:val="28"/>
-          <w:lang/>
           <w14:ligatures w14:val="none"/>
         </w:rPr>
         <w:t>Điểm cộng khuyến khích:</w:t>
@@ -2573,7 +2514,6 @@
           <w:kern w:val="0"/>
           <w:sz w:val="28"/>
           <w:szCs w:val="28"/>
-          <w:lang/>
           <w14:ligatures w14:val="none"/>
         </w:rPr>
         <w:t xml:space="preserve"> tối đa </w:t>
@@ -2586,7 +2526,6 @@
           <w:kern w:val="0"/>
           <w:sz w:val="28"/>
           <w:szCs w:val="28"/>
-          <w:lang/>
           <w14:ligatures w14:val="none"/>
         </w:rPr>
         <w:t>+1.0</w:t>
@@ -2605,7 +2544,6 @@
           <w:kern w:val="0"/>
           <w:sz w:val="28"/>
           <w:szCs w:val="28"/>
-          <w:lang/>
           <w14:ligatures w14:val="none"/>
         </w:rPr>
       </w:pPr>
@@ -2615,7 +2553,6 @@
           <w:kern w:val="0"/>
           <w:sz w:val="28"/>
           <w:szCs w:val="28"/>
-          <w:lang/>
           <w14:ligatures w14:val="none"/>
         </w:rPr>
         <w:lastRenderedPageBreak/>
@@ -2635,7 +2572,6 @@
           <w:kern w:val="0"/>
           <w:sz w:val="28"/>
           <w:szCs w:val="28"/>
-          <w:lang/>
           <w14:ligatures w14:val="none"/>
         </w:rPr>
       </w:pPr>
@@ -2645,7 +2581,6 @@
           <w:kern w:val="0"/>
           <w:sz w:val="28"/>
           <w:szCs w:val="28"/>
-          <w:lang/>
           <w14:ligatures w14:val="none"/>
         </w:rPr>
         <w:t>Thông báo thành công/thất bại</w:t>
@@ -2664,7 +2599,6 @@
           <w:kern w:val="0"/>
           <w:sz w:val="28"/>
           <w:szCs w:val="28"/>
-          <w:lang/>
           <w14:ligatures w14:val="none"/>
         </w:rPr>
       </w:pPr>
@@ -2674,7 +2608,6 @@
           <w:kern w:val="0"/>
           <w:sz w:val="28"/>
           <w:szCs w:val="28"/>
-          <w:lang/>
           <w14:ligatures w14:val="none"/>
         </w:rPr>
         <w:t>Tìm kiếm sản phẩm</w:t>
@@ -2693,7 +2626,6 @@
           <w:kern w:val="0"/>
           <w:sz w:val="28"/>
           <w:szCs w:val="28"/>
-          <w:lang/>
           <w14:ligatures w14:val="none"/>
         </w:rPr>
       </w:pPr>
@@ -2703,7 +2635,6 @@
           <w:kern w:val="0"/>
           <w:sz w:val="28"/>
           <w:szCs w:val="28"/>
-          <w:lang/>
           <w14:ligatures w14:val="none"/>
         </w:rPr>
         <w:t>Xử lý xóa ảnh cũ</w:t>
@@ -2722,7 +2653,6 @@
           <w:kern w:val="0"/>
           <w:sz w:val="28"/>
           <w:szCs w:val="28"/>
-          <w:lang/>
           <w14:ligatures w14:val="none"/>
         </w:rPr>
       </w:pPr>
@@ -2732,7 +2662,6 @@
           <w:kern w:val="0"/>
           <w:sz w:val="28"/>
           <w:szCs w:val="28"/>
-          <w:lang/>
           <w14:ligatures w14:val="none"/>
         </w:rPr>
         <w:t>Giao diện đẹp hơn yêu cầu cơ bản</w:t>
@@ -2784,6 +2713,23 @@
           <w:lang w:eastAsia="zh-CN"/>
         </w:rPr>
       </w:pPr>
+      <w:hyperlink r:id="rId9" w:history="1">
+        <w:r>
+          <w:rPr>
+            <w:rStyle w:val="Hyperlink"/>
+            <w:lang w:eastAsia="zh-CN"/>
+          </w:rPr>
+          <w:t>https://github.com/NguyenHuuSang04/CNM/tree/main/Lab_6_16_3</w:t>
+        </w:r>
+      </w:hyperlink>
+    </w:p>
+    <w:p>
+      <w:pPr>
+        <w:ind w:firstLine="0"/>
+        <w:rPr>
+          <w:lang w:eastAsia="zh-CN"/>
+        </w:rPr>
+      </w:pPr>
     </w:p>
     <w:p>
       <w:pPr>
@@ -2826,6 +2772,7 @@
       </w:pPr>
       <w:r>
         <w:rPr>
+          <w:noProof/>
           <w:lang w:eastAsia="zh-CN"/>
         </w:rPr>
         <w:drawing>
@@ -2844,7 +2791,7 @@
                     <pic:cNvPicPr/>
                   </pic:nvPicPr>
                   <pic:blipFill>
-                    <a:blip r:embed="rId9"/>
+                    <a:blip r:embed="rId10"/>
                     <a:stretch>
                       <a:fillRect/>
                     </a:stretch>
@@ -2899,6 +2846,7 @@
       </w:pPr>
       <w:r>
         <w:rPr>
+          <w:noProof/>
           <w:lang w:eastAsia="zh-CN"/>
         </w:rPr>
         <w:drawing>
@@ -2914,70 +2862,6 @@
                 <pic:pic xmlns:pic="http://schemas.openxmlformats.org/drawingml/2006/picture">
                   <pic:nvPicPr>
                     <pic:cNvPr id="1708112324" name=""/>
-                    <pic:cNvPicPr/>
-                  </pic:nvPicPr>
-                  <pic:blipFill>
-                    <a:blip r:embed="rId10"/>
-                    <a:stretch>
-                      <a:fillRect/>
-                    </a:stretch>
-                  </pic:blipFill>
-                  <pic:spPr>
-                    <a:xfrm>
-                      <a:off x="0" y="0"/>
-                      <a:ext cx="5579745" cy="2964180"/>
-                    </a:xfrm>
-                    <a:prstGeom prst="rect">
-                      <a:avLst/>
-                    </a:prstGeom>
-                  </pic:spPr>
-                </pic:pic>
-              </a:graphicData>
-            </a:graphic>
-          </wp:inline>
-        </w:drawing>
-      </w:r>
-    </w:p>
-    <w:p>
-      <w:pPr>
-        <w:pStyle w:val="Heading3"/>
-        <w:rPr>
-          <w:lang w:eastAsia="zh-CN"/>
-        </w:rPr>
-      </w:pPr>
-      <w:bookmarkStart w:id="4" w:name="_Toc224551726"/>
-      <w:r>
-        <w:rPr>
-          <w:lang w:eastAsia="zh-CN"/>
-        </w:rPr>
-        <w:t>Thêm sản phẩm</w:t>
-      </w:r>
-      <w:bookmarkEnd w:id="4"/>
-    </w:p>
-    <w:p>
-      <w:pPr>
-        <w:ind w:firstLine="0"/>
-        <w:rPr>
-          <w:lang w:eastAsia="zh-CN"/>
-        </w:rPr>
-      </w:pPr>
-      <w:r>
-        <w:rPr>
-          <w:lang w:eastAsia="zh-CN"/>
-        </w:rPr>
-        <w:drawing>
-          <wp:inline distT="0" distB="0" distL="0" distR="0" wp14:anchorId="6ECF058C" wp14:editId="7FB44901">
-            <wp:extent cx="5579745" cy="2964180"/>
-            <wp:effectExtent l="0" t="0" r="1905" b="7620"/>
-            <wp:docPr id="287492019" name="Picture 1"/>
-            <wp:cNvGraphicFramePr>
-              <a:graphicFrameLocks xmlns:a="http://schemas.openxmlformats.org/drawingml/2006/main" noChangeAspect="1"/>
-            </wp:cNvGraphicFramePr>
-            <a:graphic xmlns:a="http://schemas.openxmlformats.org/drawingml/2006/main">
-              <a:graphicData uri="http://schemas.openxmlformats.org/drawingml/2006/picture">
-                <pic:pic xmlns:pic="http://schemas.openxmlformats.org/drawingml/2006/picture">
-                  <pic:nvPicPr>
-                    <pic:cNvPr id="287492019" name=""/>
                     <pic:cNvPicPr/>
                   </pic:nvPicPr>
                   <pic:blipFill>
@@ -3004,45 +2888,37 @@
     </w:p>
     <w:p>
       <w:pPr>
-        <w:ind w:firstLine="0"/>
+        <w:pStyle w:val="Heading3"/>
         <w:rPr>
           <w:lang w:eastAsia="zh-CN"/>
         </w:rPr>
       </w:pPr>
+      <w:bookmarkStart w:id="4" w:name="_Toc224551726"/>
+      <w:r>
+        <w:rPr>
+          <w:lang w:eastAsia="zh-CN"/>
+        </w:rPr>
+        <w:t>Thêm sản phẩm</w:t>
+      </w:r>
+      <w:bookmarkEnd w:id="4"/>
     </w:p>
     <w:p>
       <w:pPr>
-        <w:pStyle w:val="Heading3"/>
+        <w:ind w:firstLine="0"/>
         <w:rPr>
           <w:lang w:eastAsia="zh-CN"/>
         </w:rPr>
       </w:pPr>
-      <w:bookmarkStart w:id="5" w:name="_Toc224551727"/>
-      <w:r>
-        <w:rPr>
+      <w:r>
+        <w:rPr>
+          <w:noProof/>
           <w:lang w:eastAsia="zh-CN"/>
         </w:rPr>
-        <w:lastRenderedPageBreak/>
-        <w:t>Sửa sản phẩm</w:t>
-      </w:r>
-      <w:bookmarkEnd w:id="5"/>
-    </w:p>
-    <w:p>
-      <w:pPr>
-        <w:ind w:firstLine="0"/>
-        <w:rPr>
-          <w:lang w:eastAsia="zh-CN"/>
-        </w:rPr>
-      </w:pPr>
-      <w:r>
-        <w:rPr>
-          <w:lang w:eastAsia="zh-CN"/>
-        </w:rPr>
         <w:drawing>
-          <wp:inline distT="0" distB="0" distL="0" distR="0" wp14:anchorId="4B744EA1" wp14:editId="136D21EF">
+          <wp:inline distT="0" distB="0" distL="0" distR="0" wp14:anchorId="6ECF058C" wp14:editId="7FB44901">
             <wp:extent cx="5579745" cy="2964180"/>
             <wp:effectExtent l="0" t="0" r="1905" b="7620"/>
-            <wp:docPr id="163158443" name="Picture 1"/>
+            <wp:docPr id="287492019" name="Picture 1"/>
             <wp:cNvGraphicFramePr>
               <a:graphicFrameLocks xmlns:a="http://schemas.openxmlformats.org/drawingml/2006/main" noChangeAspect="1"/>
             </wp:cNvGraphicFramePr>
@@ -3050,7 +2926,7 @@
               <a:graphicData uri="http://schemas.openxmlformats.org/drawingml/2006/picture">
                 <pic:pic xmlns:pic="http://schemas.openxmlformats.org/drawingml/2006/picture">
                   <pic:nvPicPr>
-                    <pic:cNvPr id="163158443" name=""/>
+                    <pic:cNvPr id="287492019" name=""/>
                     <pic:cNvPicPr/>
                   </pic:nvPicPr>
                   <pic:blipFill>
@@ -3077,28 +2953,31 @@
     </w:p>
     <w:p>
       <w:pPr>
-        <w:pStyle w:val="Heading3"/>
+        <w:ind w:firstLine="0"/>
         <w:rPr>
           <w:lang w:eastAsia="zh-CN"/>
         </w:rPr>
       </w:pPr>
-      <w:bookmarkStart w:id="6" w:name="_Toc224551728"/>
-      <w:r>
-        <w:rPr>
-          <w:lang w:eastAsia="zh-CN"/>
-        </w:rPr>
-        <w:t>Màn hình xóa</w:t>
-      </w:r>
-      <w:bookmarkEnd w:id="6"/>
-      <w:r>
-        <w:rPr>
-          <w:lang w:eastAsia="zh-CN"/>
-        </w:rPr>
-        <w:t xml:space="preserve"> </w:t>
-      </w:r>
     </w:p>
     <w:p>
       <w:pPr>
+        <w:pStyle w:val="Heading3"/>
+        <w:rPr>
+          <w:lang w:eastAsia="zh-CN"/>
+        </w:rPr>
+      </w:pPr>
+      <w:bookmarkStart w:id="5" w:name="_Toc224551727"/>
+      <w:r>
+        <w:rPr>
+          <w:lang w:eastAsia="zh-CN"/>
+        </w:rPr>
+        <w:lastRenderedPageBreak/>
+        <w:t>Sửa sản phẩm</w:t>
+      </w:r>
+      <w:bookmarkEnd w:id="5"/>
+    </w:p>
+    <w:p>
+      <w:pPr>
         <w:ind w:firstLine="0"/>
         <w:rPr>
           <w:lang w:eastAsia="zh-CN"/>
@@ -3106,13 +2985,14 @@
       </w:pPr>
       <w:r>
         <w:rPr>
+          <w:noProof/>
           <w:lang w:eastAsia="zh-CN"/>
         </w:rPr>
         <w:drawing>
-          <wp:inline distT="0" distB="0" distL="0" distR="0" wp14:anchorId="618A0821" wp14:editId="5EBEC169">
+          <wp:inline distT="0" distB="0" distL="0" distR="0" wp14:anchorId="4B744EA1" wp14:editId="136D21EF">
             <wp:extent cx="5579745" cy="2964180"/>
             <wp:effectExtent l="0" t="0" r="1905" b="7620"/>
-            <wp:docPr id="79777245" name="Picture 1"/>
+            <wp:docPr id="163158443" name="Picture 1"/>
             <wp:cNvGraphicFramePr>
               <a:graphicFrameLocks xmlns:a="http://schemas.openxmlformats.org/drawingml/2006/main" noChangeAspect="1"/>
             </wp:cNvGraphicFramePr>
@@ -3120,7 +3000,7 @@
               <a:graphicData uri="http://schemas.openxmlformats.org/drawingml/2006/picture">
                 <pic:pic xmlns:pic="http://schemas.openxmlformats.org/drawingml/2006/picture">
                   <pic:nvPicPr>
-                    <pic:cNvPr id="79777245" name=""/>
+                    <pic:cNvPr id="163158443" name=""/>
                     <pic:cNvPicPr/>
                   </pic:nvPicPr>
                   <pic:blipFill>
@@ -3145,8 +3025,79 @@
         </w:drawing>
       </w:r>
     </w:p>
+    <w:p>
+      <w:pPr>
+        <w:pStyle w:val="Heading3"/>
+        <w:rPr>
+          <w:lang w:eastAsia="zh-CN"/>
+        </w:rPr>
+      </w:pPr>
+      <w:bookmarkStart w:id="6" w:name="_Toc224551728"/>
+      <w:r>
+        <w:rPr>
+          <w:lang w:eastAsia="zh-CN"/>
+        </w:rPr>
+        <w:t>Màn hình xóa</w:t>
+      </w:r>
+      <w:bookmarkEnd w:id="6"/>
+      <w:r>
+        <w:rPr>
+          <w:lang w:eastAsia="zh-CN"/>
+        </w:rPr>
+        <w:t xml:space="preserve"> </w:t>
+      </w:r>
+    </w:p>
+    <w:p>
+      <w:pPr>
+        <w:ind w:firstLine="0"/>
+        <w:rPr>
+          <w:lang w:eastAsia="zh-CN"/>
+        </w:rPr>
+      </w:pPr>
+      <w:r>
+        <w:rPr>
+          <w:noProof/>
+          <w:lang w:eastAsia="zh-CN"/>
+        </w:rPr>
+        <w:drawing>
+          <wp:inline distT="0" distB="0" distL="0" distR="0" wp14:anchorId="618A0821" wp14:editId="5EBEC169">
+            <wp:extent cx="5579745" cy="2964180"/>
+            <wp:effectExtent l="0" t="0" r="1905" b="7620"/>
+            <wp:docPr id="79777245" name="Picture 1"/>
+            <wp:cNvGraphicFramePr>
+              <a:graphicFrameLocks xmlns:a="http://schemas.openxmlformats.org/drawingml/2006/main" noChangeAspect="1"/>
+            </wp:cNvGraphicFramePr>
+            <a:graphic xmlns:a="http://schemas.openxmlformats.org/drawingml/2006/main">
+              <a:graphicData uri="http://schemas.openxmlformats.org/drawingml/2006/picture">
+                <pic:pic xmlns:pic="http://schemas.openxmlformats.org/drawingml/2006/picture">
+                  <pic:nvPicPr>
+                    <pic:cNvPr id="79777245" name=""/>
+                    <pic:cNvPicPr/>
+                  </pic:nvPicPr>
+                  <pic:blipFill>
+                    <a:blip r:embed="rId14"/>
+                    <a:stretch>
+                      <a:fillRect/>
+                    </a:stretch>
+                  </pic:blipFill>
+                  <pic:spPr>
+                    <a:xfrm>
+                      <a:off x="0" y="0"/>
+                      <a:ext cx="5579745" cy="2964180"/>
+                    </a:xfrm>
+                    <a:prstGeom prst="rect">
+                      <a:avLst/>
+                    </a:prstGeom>
+                  </pic:spPr>
+                </pic:pic>
+              </a:graphicData>
+            </a:graphic>
+          </wp:inline>
+        </w:drawing>
+      </w:r>
+    </w:p>
     <w:sectPr>
-      <w:footerReference w:type="default" r:id="rId14"/>
+      <w:footerReference w:type="default" r:id="rId15"/>
       <w:type w:val="continuous"/>
       <w:pgSz w:w="11906" w:h="16838"/>
       <w:pgMar w:top="1701" w:right="1134" w:bottom="1701" w:left="1985" w:header="6" w:footer="142" w:gutter="0"/>
@@ -6836,6 +6787,18 @@
       </w:tblBorders>
     </w:tblPr>
   </w:style>
+  <w:style w:type="character" w:styleId="UnresolvedMention">
+    <w:name w:val="Unresolved Mention"/>
+    <w:basedOn w:val="DefaultParagraphFont"/>
+    <w:uiPriority w:val="99"/>
+    <w:semiHidden/>
+    <w:unhideWhenUsed/>
+    <w:rsid w:val="00BF15C7"/>
+    <w:rPr>
+      <w:color w:val="605E5C"/>
+      <w:shd w:val="clear" w:color="auto" w:fill="E1DFDD"/>
+    </w:rPr>
+  </w:style>
 </w:styles>
 </file>
 

</xml_diff>